<commit_message>
Update NSF Synergistic Activities with Brian's decisions
- Header carries the position title (Assistant Professor of Medical
  Physics)
- Item 5: drop "manuscript reviewer since 2019"
- README: TG-263 confirmed "Present"; AAPM committee memberships live
  here; AHRQ R18 HS029474 ended 2025 and is no longer current support;
  page-fill numbers refreshed
- export_pdf.ps1: pass plain strings to Word COM SaveAs, which rejects
  PSObject-wrapped paths

Co-Authored-By: Claude Opus 5.5 <noreply@anthropic.com>
</commit_message>
<xml_diff>
--- a/Clincal_CV/NSF/4_Synergistic_Activities/Anderson_BM_NSF_Synergistic_Activities.docx
+++ b/Clincal_CV/NSF/4_Synergistic_Activities/Anderson_BM_NSF_Synergistic_Activities.docx
@@ -14,7 +14,7 @@
           <w:i w:val="0"/>
           <w:sz w:val="22"/>
         </w:rPr>
-        <w:t>Synergistic Activities – Brian Mark Anderson, PhD, DABR, University of California, San Diego</w:t>
+        <w:t>Synergistic Activities – Brian Mark Anderson, PhD, DABR, Assistant Professor of Medical Physics, University of California, San Diego</w:t>
       </w:r>
     </w:p>
     <w:p>
@@ -204,7 +204,7 @@
           <w:i w:val="0"/>
           <w:sz w:val="22"/>
         </w:rPr>
-        <w:t xml:space="preserve"> Associate Editor of Medical Physics and member of its Board of Associate Editors (2023–present; ad hoc Associate Editor 2020–2021, manuscript reviewer since 2019). Member of the AAPM Machine Intelligence Subcommittee (2024–present), the AAPM QUANTEC 2 Working Group (2026–present), and Medical Physicists for World Benefit (2017–present). Founding member and domestic liaison of MD Anderson’s International Students Association (2019–2021), which helps international graduate students with the transition to the United States; STEM outreach to local students through AAPM WizKids (2018–2019) and UTHealth Science Night (2017–2019); and Co-Investigator on AHRQ R18 HS029474 (2024–2025), developing AI-enhanced pre-treatment peer review to improve patient safety in radiation oncology.</w:t>
+        <w:t xml:space="preserve"> Associate Editor of Medical Physics and member of its Board of Associate Editors (2023–present; ad hoc Associate Editor 2020–2021). Member of the AAPM Machine Intelligence Subcommittee (2024–present), the AAPM QUANTEC 2 Working Group (2026–present), and Medical Physicists for World Benefit (2017–present). Founding member and domestic liaison of MD Anderson’s International Students Association (2019–2021), which helps international graduate students with the transition to the United States; STEM outreach to local students through AAPM WizKids (2018–2019) and UTHealth Science Night (2017–2019); and Co-Investigator on AHRQ R18 HS029474 (2024–2025), developing AI-enhanced pre-treatment peer review to improve patient safety in radiation oncology.</w:t>
       </w:r>
     </w:p>
     <w:sectPr>

</xml_diff>